<commit_message>
feat(frontend): implement domain-driven frontend architecture and sync project rules
- Restructure frontend/src into 4 clean layers: app, core, features, styles
- App layer: SSOT route dictionary (paths.js), AppRoutes with React Router v6 Outlet, PrivateRoute guard
- Core layer: shared UI primitives (Button, Card, Badge, Spinner), CitationBadge/Drawer, ExportDropdown, Axios client with JWT interceptor, Zustand stores (authStore, workspaceStore), hooks (useAuth, useWorkspace, useDebounce), download helper
- Features layer: domain-driven modules (auth, workspace, documents, lesson-planner, quiz-generator, history)
- Styles layer: custom CSS tokens, base reset, components, layout grid, main entry
- Sync 11 standardized rule files in .agents/rules/
- Add ATC-MASTER-TASKS.md, CHECKLIST-TIEN-DO.md, FRONTEND_ARCHITECTURE.md in docs/
- Tested and verified: npm run build and mvn test pass 100%
</commit_message>
<xml_diff>
--- a/docs/Project_Detail/AI_Teacher_Copilot_for_K-12_Teachers_-_Project_Detail.docx
+++ b/docs/Project_Detail/AI_Teacher_Copilot_for_K-12_Teachers_-_Project_Detail.docx
@@ -234,6 +234,51 @@
     </w:p>
     <w:p>
       <w:pPr>
+        <w:pStyle w:val="ListParagraph"/>
+        <w:numPr>
+          <w:ilvl w:val="0"/>
+          <w:numId w:val="2"/>
+        </w:numPr>
+        <w:spacing w:after="60"/>
+        <w:rPr>
+          <w:sz w:val="28"/>
+          <w:szCs w:val="28"/>
+        </w:rPr>
+      </w:pPr>
+      <w:r>
+        <w:rPr>
+          <w:b/>
+          <w:bCs/>
+          <w:sz w:val="28"/>
+          <w:szCs w:val="28"/>
+        </w:rPr>
+        <w:t xml:space="preserve">Git branching strategy: </w:t>
+      </w:r>
+      <w:r>
+        <w:rPr>
+          <w:sz w:val="28"/>
+          <w:szCs w:val="28"/>
+        </w:rPr>
+        <w:t xml:space="preserve">áp dụng quy ước Git Flow 3 tầng chính thức </w:t>
+      </w:r>
+      <w:r>
+        <w:rPr>
+          <w:rFonts w:ascii="Consolas" w:hAnsi="Consolas" w:cs="Consolas"/>
+          <w:sz w:val="26"/>
+          <w:szCs w:val="26"/>
+        </w:rPr>
+        <w:t>feature/* → (PR &amp; CI) → develop → (Full Gate) → main</w:t>
+      </w:r>
+      <w:r>
+        <w:rPr>
+          <w:sz w:val="28"/>
+          <w:szCs w:val="28"/>
+        </w:rPr>
+        <w:t>: nhánh feature/* mở PR kèm CI cơ bản để merge vào develop; develop merge vào main khi qua đầy đủ Full Gate (test, review, kiểm tra chất lượng).</w:t>
+      </w:r>
+    </w:p>
+    <w:p>
+      <w:pPr>
         <w:pStyle w:val="Heading1"/>
         <w:rPr>
           <w:color w:val="auto"/>
@@ -390,6 +435,7 @@
           <w:sz w:val="28"/>
           <w:szCs w:val="28"/>
         </w:rPr>
+        <w:lastRenderedPageBreak/>
         <w:t>Không có cấu trúc đầu ra cố định, khó tái sử dụng và kiểm soát chất lượng.</w:t>
       </w:r>
     </w:p>
@@ -429,7 +475,6 @@
           <w:sz w:val="28"/>
           <w:szCs w:val="28"/>
         </w:rPr>
-        <w:lastRenderedPageBreak/>
         <w:t>2.2 Đối tượng người dùng</w:t>
       </w:r>
     </w:p>
@@ -781,7 +826,6 @@
           <w:sz w:val="28"/>
           <w:szCs w:val="28"/>
         </w:rPr>
-        <w:lastRenderedPageBreak/>
         <w:t>3.2 Quy trình nghiệp vụ — TO-BE</w:t>
       </w:r>
     </w:p>
@@ -930,7 +974,6 @@
           <w:sz w:val="28"/>
           <w:szCs w:val="28"/>
         </w:rPr>
-        <w:lastRenderedPageBreak/>
         <w:t>3.3 Yêu cầu chức năng — Mức tổng quan</w:t>
       </w:r>
     </w:p>
@@ -1415,14 +1458,7 @@
           <w:sz w:val="28"/>
           <w:szCs w:val="28"/>
         </w:rPr>
-        <w:t>nội dung bên trong tài liệu (PDF/DOCX) không được phép override system/developer instructions, thay đổi system behavior, yêu cầu tiết lộ system prompt, truy cập dữ liệu workspace khác, hoặc tự động thực hiện hành động ngoài phạm vi sinh nội dung</w:t>
-      </w:r>
-      <w:r>
-        <w:rPr>
-          <w:sz w:val="28"/>
-          <w:szCs w:val="28"/>
-        </w:rPr>
-        <w:t>.</w:t>
+        <w:t>nội dung bên trong tài liệu (PDF/DOCX) không được phép override system/developer instructions, thay đổi system behavior, yêu cầu tiết lộ system prompt, truy cập dữ liệu workspace khác, hoặc tự động thực hiện hành động ngoài phạm vi sinh nội dung.</w:t>
       </w:r>
     </w:p>
     <w:p>
@@ -1440,6 +1476,7 @@
           <w:sz w:val="28"/>
           <w:szCs w:val="28"/>
         </w:rPr>
+        <w:lastRenderedPageBreak/>
         <w:t>Hiệu năng</w:t>
       </w:r>
     </w:p>
@@ -1482,7 +1519,6 @@
           <w:sz w:val="28"/>
           <w:szCs w:val="28"/>
         </w:rPr>
-        <w:lastRenderedPageBreak/>
         <w:t>Thao tác AI generation có thể mất nhiều thời gian hơn và nên hiển thị trạng thái xử lý/phản hồi rõ ràng.</w:t>
       </w:r>
     </w:p>
@@ -1927,6 +1963,7 @@
           <w:sz w:val="28"/>
           <w:szCs w:val="28"/>
         </w:rPr>
+        <w:lastRenderedPageBreak/>
         <w:t>Kết quả sinh ra có thể được xem và kiểm tra/duyệt (review).</w:t>
       </w:r>
     </w:p>
@@ -1990,7 +2027,6 @@
           <w:sz w:val="28"/>
           <w:szCs w:val="28"/>
         </w:rPr>
-        <w:lastRenderedPageBreak/>
         <w:t>Kết quả có thể được xuất theo định dạng được hỗ trợ.</w:t>
       </w:r>
     </w:p>
@@ -2556,6 +2592,7 @@
           <w:sz w:val="28"/>
           <w:szCs w:val="28"/>
         </w:rPr>
+        <w:lastRenderedPageBreak/>
         <w:t>Kiểm tra, Quản lý &amp; Xuất tài liệu</w:t>
       </w:r>
     </w:p>
@@ -2619,7 +2656,6 @@
           <w:sz w:val="28"/>
           <w:szCs w:val="28"/>
         </w:rPr>
-        <w:lastRenderedPageBreak/>
         <w:t>Citation / Source Reference</w:t>
       </w:r>
     </w:p>
@@ -2711,6 +2747,7 @@
           <w:color w:val="auto"/>
           <w:sz w:val="32"/>
           <w:szCs w:val="32"/>
+          <w:lang w:val="vi-VN"/>
         </w:rPr>
       </w:pPr>
       <w:r>
@@ -2719,7 +2756,7 @@
           <w:sz w:val="32"/>
           <w:szCs w:val="32"/>
         </w:rPr>
-        <w:t>5. Phạm vi bàn giao 6 tháng (Đề xuất)</w:t>
+        <w:t>5. Phạm vi bàn giao 6 tháng</w:t>
       </w:r>
     </w:p>
     <w:p>
@@ -3008,6 +3045,7 @@
           <w:sz w:val="28"/>
           <w:szCs w:val="28"/>
         </w:rPr>
+        <w:lastRenderedPageBreak/>
         <w:t>6.1 Công nghệ sử dụng &amp; Lý do lựa chọn</w:t>
       </w:r>
     </w:p>
@@ -3050,7 +3088,6 @@
           <w:sz w:val="28"/>
           <w:szCs w:val="28"/>
         </w:rPr>
-        <w:lastRenderedPageBreak/>
         <w:t>Backend: Java Spring Boot (core: auth, workspace, logic nghiệp vụ, document metadata, lịch sử kiểm tra/duyệt (review), API chính)</w:t>
       </w:r>
     </w:p>
@@ -3240,6 +3277,7 @@
           <w:sz w:val="24"/>
           <w:szCs w:val="24"/>
         </w:rPr>
+        <w:lastRenderedPageBreak/>
         <w:drawing>
           <wp:inline distT="0" distB="0" distL="0" distR="0" wp14:anchorId="3CF6984D" wp14:editId="5B3D9777">
             <wp:extent cx="5905500" cy="4391025"/>
@@ -3301,17 +3339,7 @@
           <w:sz w:val="20"/>
           <w:szCs w:val="20"/>
         </w:rPr>
-        <w:t>Hình 2 — AI Teacher Copilot và các actor/hệ thống bên ngoài</w:t>
-      </w:r>
-      <w:r>
-        <w:rPr>
-          <w:i/>
-          <w:iCs/>
-          <w:color w:val="555555"/>
-          <w:sz w:val="20"/>
-          <w:szCs w:val="20"/>
-        </w:rPr>
-        <w:t>.</w:t>
+        <w:t>Hình 2 — AI Teacher Copilot và các actor/hệ thống bên ngoài.</w:t>
       </w:r>
     </w:p>
     <w:p>
@@ -3329,7 +3357,6 @@
           <w:sz w:val="28"/>
           <w:szCs w:val="28"/>
         </w:rPr>
-        <w:lastRenderedPageBreak/>
         <w:t>6.3 Kiến trúc hệ thống — Mức tổng quan</w:t>
       </w:r>
     </w:p>
@@ -3426,6 +3453,68 @@
           <w:szCs w:val="28"/>
         </w:rPr>
         <w:t>Spring Boot và FastAPI giao tiếp qua REST/gRPC nội bộ; Spring Boot là entry point cho frontend, FastAPI chỉ phục vụ nội bộ (không expose trực tiếp ra internet) để giảm bề mặt tấn công và đơn giản hoá auth.</w:t>
+      </w:r>
+    </w:p>
+    <w:p>
+      <w:pPr>
+        <w:spacing w:before="120" w:after="60"/>
+        <w:rPr>
+          <w:sz w:val="28"/>
+          <w:szCs w:val="28"/>
+        </w:rPr>
+      </w:pPr>
+      <w:r>
+        <w:rPr>
+          <w:sz w:val="28"/>
+          <w:szCs w:val="28"/>
+        </w:rPr>
+        <w:t>Cấu trúc thư mục ở root level (chuẩn hoá, không đặt ai-service lồng trong backend):</w:t>
+      </w:r>
+    </w:p>
+    <w:p>
+      <w:pPr>
+        <w:spacing w:after="120"/>
+        <w:ind w:left="284"/>
+      </w:pPr>
+      <w:r>
+        <w:rPr>
+          <w:rFonts w:ascii="Consolas" w:hAnsi="Consolas" w:cs="Consolas"/>
+        </w:rPr>
+        <w:t>ai-teacher-copilot/</w:t>
+      </w:r>
+      <w:r>
+        <w:rPr>
+          <w:rFonts w:ascii="Consolas" w:hAnsi="Consolas" w:cs="Consolas"/>
+        </w:rPr>
+        <w:br/>
+        <w:t>├── backend/          (Spring Boot Core Backend)</w:t>
+      </w:r>
+      <w:r>
+        <w:rPr>
+          <w:rFonts w:ascii="Consolas" w:hAnsi="Consolas" w:cs="Consolas"/>
+        </w:rPr>
+        <w:br/>
+        <w:t>├── ai-service/       (FastAPI AI Service)</w:t>
+      </w:r>
+      <w:r>
+        <w:rPr>
+          <w:rFonts w:ascii="Consolas" w:hAnsi="Consolas" w:cs="Consolas"/>
+        </w:rPr>
+        <w:br/>
+        <w:t>├── frontend/         (React Vite)</w:t>
+      </w:r>
+      <w:r>
+        <w:rPr>
+          <w:rFonts w:ascii="Consolas" w:hAnsi="Consolas" w:cs="Consolas"/>
+        </w:rPr>
+        <w:br/>
+        <w:t>└── infrastructure/   (Docker, Docker Compose, Postgres, MinIO)</w:t>
+      </w:r>
+      <w:r>
+        <w:rPr>
+          <w:rFonts w:ascii="Consolas" w:hAnsi="Consolas" w:cs="Consolas"/>
+        </w:rPr>
+        <w:br/>
       </w:r>
     </w:p>
     <w:p>
@@ -3443,6 +3532,7 @@
           <w:sz w:val="24"/>
           <w:szCs w:val="24"/>
         </w:rPr>
+        <w:lastRenderedPageBreak/>
         <w:drawing>
           <wp:inline distT="0" distB="0" distL="0" distR="0" wp14:anchorId="64E893BC" wp14:editId="49787587">
             <wp:extent cx="5810250" cy="4800600"/>
@@ -3500,17 +3590,7 @@
           <w:sz w:val="20"/>
           <w:szCs w:val="20"/>
         </w:rPr>
-        <w:t>Hình 3 — Kiến trúc tổng thể: React → Spring Boot → (PostgreSQL/pgvector, MinIO, FastAPI) → LLM Provider</w:t>
-      </w:r>
-      <w:r>
-        <w:rPr>
-          <w:i/>
-          <w:iCs/>
-          <w:color w:val="555555"/>
-          <w:sz w:val="20"/>
-          <w:szCs w:val="20"/>
-        </w:rPr>
-        <w:t>.</w:t>
+        <w:t>Hình 3 — Kiến trúc tổng thể: React → Spring Boot → (PostgreSQL/pgvector, MinIO, FastAPI) → LLM Provider.</w:t>
       </w:r>
     </w:p>
     <w:p>
@@ -3608,7 +3688,6 @@
           <w:sz w:val="32"/>
           <w:szCs w:val="32"/>
         </w:rPr>
-        <w:lastRenderedPageBreak/>
         <w:t xml:space="preserve">7. </w:t>
       </w:r>
       <w:r>
@@ -3734,6 +3813,7 @@
           <w:sz w:val="28"/>
           <w:szCs w:val="28"/>
         </w:rPr>
+        <w:lastRenderedPageBreak/>
         <w:t>Đầu ra kèm citation (trỏ về chunk/tài liệu nguồn) → hiển thị cho giáo viên kiểm tra/chỉnh sửa/tạo lại.</w:t>
       </w:r>
     </w:p>
@@ -3795,6 +3875,51 @@
           <w:szCs w:val="28"/>
         </w:rPr>
         <w:t>metadata-filtered semantic/vector retrieval. Evaluation path: nếu baseline chưa đạt chất lượng retrieval mong muốn, có thể đánh giá thêm full-text/hybrid retrieval; reranking chỉ được bổ sung khi evaluation cho thấy cần thiết — không đặt hybrid retrieval/RRF/reranker làm must-have của MVP.</w:t>
+      </w:r>
+    </w:p>
+    <w:p>
+      <w:pPr>
+        <w:pStyle w:val="ListParagraph"/>
+        <w:numPr>
+          <w:ilvl w:val="0"/>
+          <w:numId w:val="2"/>
+        </w:numPr>
+        <w:spacing w:after="60"/>
+        <w:rPr>
+          <w:sz w:val="28"/>
+          <w:szCs w:val="28"/>
+        </w:rPr>
+      </w:pPr>
+      <w:r>
+        <w:rPr>
+          <w:b/>
+          <w:bCs/>
+          <w:sz w:val="28"/>
+          <w:szCs w:val="28"/>
+        </w:rPr>
+        <w:t xml:space="preserve">Implementation standard: </w:t>
+      </w:r>
+      <w:r>
+        <w:rPr>
+          <w:sz w:val="28"/>
+          <w:szCs w:val="28"/>
+        </w:rPr>
+        <w:t xml:space="preserve">toàn bộ context tài liệu trích xuất từ RAG bắt buộc phải được truyền vào LLM bên trong ranh giới định danh </w:t>
+      </w:r>
+      <w:r>
+        <w:rPr>
+          <w:rFonts w:ascii="Consolas" w:hAnsi="Consolas" w:cs="Consolas"/>
+          <w:sz w:val="26"/>
+          <w:szCs w:val="26"/>
+        </w:rPr>
+        <w:t>&lt;sources&gt;...&lt;/sources&gt;</w:t>
+      </w:r>
+      <w:r>
+        <w:rPr>
+          <w:sz w:val="28"/>
+          <w:szCs w:val="28"/>
+        </w:rPr>
+        <w:t xml:space="preserve"> và được xử lý thuần túy là dữ liệu tham khảo không tin cậy, nhất quán với nguyên tắc untrusted data đã nêu ở Mục 3.4 và Mục 10.1.</w:t>
       </w:r>
     </w:p>
     <w:p>
@@ -3955,7 +4080,6 @@
           <w:sz w:val="28"/>
           <w:szCs w:val="28"/>
         </w:rPr>
-        <w:lastRenderedPageBreak/>
         <w:t xml:space="preserve">Việc có trích dẫn không đảm bảo trích dẫn đúng hoặc khẳng định đúng. </w:t>
       </w:r>
       <w:r>
@@ -3999,6 +4123,7 @@
           <w:sz w:val="28"/>
           <w:szCs w:val="28"/>
         </w:rPr>
+        <w:lastRenderedPageBreak/>
         <w:t>8.1 Entity Relationship Diagram (ERD)</w:t>
       </w:r>
     </w:p>
@@ -4467,15 +4592,7 @@
                 <w:sz w:val="24"/>
                 <w:szCs w:val="24"/>
               </w:rPr>
-              <w:t xml:space="preserve">Kiến trúc hệ thống, ERD, API contract (Spring Boot ↔ FastAPI), </w:t>
-            </w:r>
-            <w:r>
-              <w:rPr>
-                <w:sz w:val="24"/>
-                <w:szCs w:val="24"/>
-              </w:rPr>
-              <w:lastRenderedPageBreak/>
-              <w:t>wireframe cho 3 luồng chính (tải lên, sinh nội dung, kiểm tra/xuất tài liệu)</w:t>
+              <w:t>Kiến trúc hệ thống, ERD, API contract (Spring Boot ↔ FastAPI), wireframe cho 3 luồng chính (tải lên, sinh nội dung, kiểm tra/xuất tài liệu)</w:t>
             </w:r>
           </w:p>
         </w:tc>
@@ -4502,7 +4619,6 @@
                 <w:sz w:val="24"/>
                 <w:szCs w:val="24"/>
               </w:rPr>
-              <w:lastRenderedPageBreak/>
               <w:t>Tài liệu kiến trúc, ERD, wireframe</w:t>
             </w:r>
           </w:p>
@@ -4646,6 +4762,7 @@
                 <w:sz w:val="24"/>
                 <w:szCs w:val="24"/>
               </w:rPr>
+              <w:lastRenderedPageBreak/>
               <w:t>Giai đoạn 4 — Document Knowledge Base</w:t>
             </w:r>
           </w:p>
@@ -5488,15 +5605,7 @@
                 <w:sz w:val="24"/>
                 <w:szCs w:val="24"/>
               </w:rPr>
-              <w:t xml:space="preserve">Chỉ cam kết Lesson Planner + Quiz là bắt buộc; Rubric là nên có (triển khai nếu tiến độ tốt); Bloom-tagging gộp vào Quiz thay vì tách riêng; Slide Outline và Analytics dashboard đầy đủ thuộc diện </w:t>
-            </w:r>
-            <w:r>
-              <w:rPr>
-                <w:sz w:val="24"/>
-                <w:szCs w:val="24"/>
-              </w:rPr>
-              <w:lastRenderedPageBreak/>
-              <w:t>hoãn lại/loại bỏ khỏi phạm vi 6 tháng đầu</w:t>
+              <w:t>Chỉ cam kết Lesson Planner + Quiz là bắt buộc; Rubric là nên có (triển khai nếu tiến độ tốt); Bloom-tagging gộp vào Quiz thay vì tách riêng; Slide Outline và Analytics dashboard đầy đủ thuộc diện hoãn lại/loại bỏ khỏi phạm vi 6 tháng đầu</w:t>
             </w:r>
           </w:p>
         </w:tc>
@@ -5525,7 +5634,6 @@
                 <w:sz w:val="24"/>
                 <w:szCs w:val="24"/>
               </w:rPr>
-              <w:lastRenderedPageBreak/>
               <w:t>Hai backend service (Spring Boot + FastAPI) tăng chi phí vận hành, network boundary, versioning cho 1 dev</w:t>
             </w:r>
           </w:p>
@@ -5639,6 +5747,7 @@
                 <w:sz w:val="24"/>
                 <w:szCs w:val="24"/>
               </w:rPr>
+              <w:lastRenderedPageBreak/>
               <w:t>Dữ liệu SGK/tài liệu giảng dạy dùng để demo RAG có thể vướng bản quyền hoặc khó thu thập đủ số lượng</w:t>
             </w:r>
           </w:p>
@@ -6242,15 +6351,7 @@
           <w:sz w:val="28"/>
           <w:szCs w:val="28"/>
         </w:rPr>
-        <w:t xml:space="preserve">Có thể hoàn thành trong 6 tháng với 1 solo developer, với điều kiện giữ phạm vi ở 2 loại nội dung bắt buộc (Lesson Planner + Quiz Generator) và chỉ triển khai tối đa 1 loại nội dung nên có </w:t>
-      </w:r>
-      <w:r>
-        <w:rPr>
-          <w:sz w:val="28"/>
-          <w:szCs w:val="28"/>
-        </w:rPr>
-        <w:lastRenderedPageBreak/>
-        <w:t>(Rubric Generator) nếu tiến độ cho phép; không mở rộng thêm phạm vi sau khi bắt đầu triển khai.</w:t>
+        <w:t>Có thể hoàn thành trong 6 tháng với 1 solo developer, với điều kiện giữ phạm vi ở 2 loại nội dung bắt buộc (Lesson Planner + Quiz Generator) và chỉ triển khai tối đa 1 loại nội dung nên có (Rubric Generator) nếu tiến độ cho phép; không mở rộng thêm phạm vi sau khi bắt đầu triển khai.</w:t>
       </w:r>
     </w:p>
     <w:p>
@@ -6333,6 +6434,7 @@
           <w:sz w:val="28"/>
           <w:szCs w:val="28"/>
         </w:rPr>
+        <w:lastRenderedPageBreak/>
         <w:t xml:space="preserve">Dữ liệu nào cần cho demo RAG? </w:t>
       </w:r>
       <w:r>
@@ -6712,7 +6814,67 @@
           <w:sz w:val="32"/>
           <w:szCs w:val="32"/>
         </w:rPr>
-        <w:t>12. Câu hỏi / Quyết định cần Mentor xác nhận</w:t>
+        <w:t>12. Quyết định Kiến trúc &amp; Nghiệp vụ Đã được Phê duyệt</w:t>
+      </w:r>
+    </w:p>
+    <w:p>
+      <w:pPr>
+        <w:pStyle w:val="Heading2"/>
+        <w:rPr>
+          <w:color w:val="auto"/>
+          <w:sz w:val="28"/>
+          <w:szCs w:val="28"/>
+        </w:rPr>
+      </w:pPr>
+      <w:r>
+        <w:rPr>
+          <w:color w:val="auto"/>
+          <w:sz w:val="28"/>
+          <w:szCs w:val="28"/>
+        </w:rPr>
+        <w:t>Các quyết định đã được phê duyệt</w:t>
+      </w:r>
+    </w:p>
+    <w:p>
+      <w:pPr>
+        <w:pStyle w:val="ListParagraph"/>
+        <w:numPr>
+          <w:ilvl w:val="0"/>
+          <w:numId w:val="2"/>
+        </w:numPr>
+        <w:spacing w:after="60"/>
+        <w:rPr>
+          <w:sz w:val="28"/>
+          <w:szCs w:val="28"/>
+        </w:rPr>
+      </w:pPr>
+      <w:r>
+        <w:rPr>
+          <w:sz w:val="28"/>
+          <w:szCs w:val="28"/>
+        </w:rPr>
+        <w:t>Phạm vi MVP: đã chốt chính thức 2 loại nội dung bắt buộc (Lesson Planner + Quiz) và 1 loại nội dung nên có (Rubric). Slide Outline Generator và Full Dashboard thuộc diện hoãn lại.</w:t>
+      </w:r>
+    </w:p>
+    <w:p>
+      <w:pPr>
+        <w:pStyle w:val="ListParagraph"/>
+        <w:numPr>
+          <w:ilvl w:val="0"/>
+          <w:numId w:val="2"/>
+        </w:numPr>
+        <w:spacing w:after="60"/>
+        <w:rPr>
+          <w:sz w:val="28"/>
+          <w:szCs w:val="28"/>
+        </w:rPr>
+      </w:pPr>
+      <w:r>
+        <w:rPr>
+          <w:sz w:val="28"/>
+          <w:szCs w:val="28"/>
+        </w:rPr>
+        <w:t>Kiến trúc backend: đã chốt chính thức giữ 2 backend service độc lập (Spring Boot core backend + FastAPI AI service), đặt ở root level (backend/ và ai-service/).</w:t>
       </w:r>
     </w:p>
     <w:p>
@@ -6734,49 +6896,46 @@
           <w:szCs w:val="28"/>
         </w:rPr>
         <w:lastRenderedPageBreak/>
-        <w:t>Phạm vi MVP đề xuất (2 loại nội dung bắt buộc: Lesson Planner + Quiz, Rubric là nên có) có chấp nhận được không, hay cần ưu tiên khác?</w:t>
-      </w:r>
-    </w:p>
-    <w:p>
-      <w:pPr>
-        <w:pStyle w:val="ListParagraph"/>
-        <w:numPr>
-          <w:ilvl w:val="0"/>
-          <w:numId w:val="2"/>
-        </w:numPr>
-        <w:spacing w:after="60"/>
-        <w:rPr>
-          <w:sz w:val="28"/>
-          <w:szCs w:val="28"/>
-        </w:rPr>
-      </w:pPr>
-      <w:r>
-        <w:rPr>
-          <w:sz w:val="28"/>
-          <w:szCs w:val="28"/>
-        </w:rPr>
-        <w:t>Có bắt buộc giữ 2 backend service (Spring Boot + FastAPI) hay nên đơn giản hoá còn 1 service trong 6 tháng đầu?</w:t>
-      </w:r>
-    </w:p>
-    <w:p>
-      <w:pPr>
-        <w:pStyle w:val="ListParagraph"/>
-        <w:numPr>
-          <w:ilvl w:val="0"/>
-          <w:numId w:val="2"/>
-        </w:numPr>
-        <w:spacing w:after="60"/>
-        <w:rPr>
-          <w:sz w:val="28"/>
-          <w:szCs w:val="28"/>
-        </w:rPr>
-      </w:pPr>
-      <w:r>
-        <w:rPr>
-          <w:sz w:val="28"/>
-          <w:szCs w:val="28"/>
-        </w:rPr>
-        <w:t>Nguồn tài liệu giảng dạy dùng để demo RAG: có cần xin phép/dùng nguồn cụ thể nào, hay tự chuẩn bị bộ mẫu là đủ?</w:t>
+        <w:t>Nguồn dữ liệu demo RAG: đã chốt chính thức sử dụng tài liệu tự biên soạn hoặc tài liệu mở cho 1–2 môn/lớp (Toán, Văn), không sử dụng nguyên văn sách giáo khoa có bản quyền.</w:t>
+      </w:r>
+    </w:p>
+    <w:p>
+      <w:pPr>
+        <w:pStyle w:val="ListParagraph"/>
+        <w:numPr>
+          <w:ilvl w:val="0"/>
+          <w:numId w:val="2"/>
+        </w:numPr>
+        <w:spacing w:after="60"/>
+        <w:rPr>
+          <w:sz w:val="28"/>
+          <w:szCs w:val="28"/>
+        </w:rPr>
+      </w:pPr>
+      <w:r>
+        <w:rPr>
+          <w:sz w:val="28"/>
+          <w:szCs w:val="28"/>
+        </w:rPr>
+        <w:t>Môi trường triển khai: đã chốt chính thức triển khai bằng Docker Compose trên VPS/cloud theo chuẩn cấu hình đã định sẵn.</w:t>
+      </w:r>
+    </w:p>
+    <w:p>
+      <w:pPr>
+        <w:pStyle w:val="Heading2"/>
+        <w:rPr>
+          <w:color w:val="auto"/>
+          <w:sz w:val="28"/>
+          <w:szCs w:val="28"/>
+        </w:rPr>
+      </w:pPr>
+      <w:r>
+        <w:rPr>
+          <w:color w:val="auto"/>
+          <w:sz w:val="28"/>
+          <w:szCs w:val="28"/>
+        </w:rPr>
+        <w:t>Câu hỏi còn mở</w:t>
       </w:r>
     </w:p>
     <w:p>
@@ -6819,27 +6978,6 @@
           <w:szCs w:val="28"/>
         </w:rPr>
         <w:t>Ngân sách/API key cho OpenAI hoặc Gemini: tự chi trả hay có hỗ trợ từ phía công ty/mentor?</w:t>
-      </w:r>
-    </w:p>
-    <w:p>
-      <w:pPr>
-        <w:pStyle w:val="ListParagraph"/>
-        <w:numPr>
-          <w:ilvl w:val="0"/>
-          <w:numId w:val="2"/>
-        </w:numPr>
-        <w:spacing w:after="60"/>
-        <w:rPr>
-          <w:sz w:val="28"/>
-          <w:szCs w:val="28"/>
-        </w:rPr>
-      </w:pPr>
-      <w:r>
-        <w:rPr>
-          <w:sz w:val="28"/>
-          <w:szCs w:val="28"/>
-        </w:rPr>
-        <w:t>Có ràng buộc nào về triển khai (môi trường, hosting) cần tuân theo không?</w:t>
       </w:r>
     </w:p>
     <w:sectPr>

</xml_diff>

<commit_message>
docs: sync updated official project detail docx
</commit_message>
<xml_diff>
--- a/docs/Project_Detail/AI_Teacher_Copilot_for_K-12_Teachers_-_Project_Detail.docx
+++ b/docs/Project_Detail/AI_Teacher_Copilot_for_K-12_Teachers_-_Project_Detail.docx
@@ -130,22 +130,7 @@
           <w:sz w:val="28"/>
           <w:szCs w:val="28"/>
         </w:rPr>
-        <w:t>Dự án áp dụng</w:t>
-      </w:r>
-      <w:r>
-        <w:rPr>
-          <w:sz w:val="28"/>
-          <w:szCs w:val="28"/>
-          <w:lang w:val="vi-VN"/>
-        </w:rPr>
-        <w:t xml:space="preserve"> </w:t>
-      </w:r>
-      <w:r>
-        <w:rPr>
-          <w:sz w:val="28"/>
-          <w:szCs w:val="28"/>
-        </w:rPr>
-        <w:t>Agile – Iterative/Incremental Development, triển khai theo Phase/Sprint đã mô tả ở Mục 9 (Lộ trình phát triển).</w:t>
+        <w:t>Dự án áp dụng Agile methodology, sử dụng Scrum làm framework quản lý dự án, và được triển khai theo các Phase/Sprint đã mô tả tại Mục 9 (Lộ trình phát triển).</w:t>
       </w:r>
     </w:p>
     <w:p>
@@ -7708,7 +7693,6 @@
   <w:style w:type="character" w:default="1" w:styleId="DefaultParagraphFont">
     <w:name w:val="Default Paragraph Font"/>
     <w:uiPriority w:val="1"/>
-    <w:semiHidden/>
     <w:unhideWhenUsed/>
   </w:style>
   <w:style w:type="table" w:default="1" w:styleId="TableNormal">

</xml_diff>